<commit_message>
Backup Wassenaar before publish (2026-03-19)
Made-with: Cursor
</commit_message>
<xml_diff>
--- a/wassenaar/collegevoorstel sjabloon Wassenaar.docx
+++ b/wassenaar/collegevoorstel sjabloon Wassenaar.docx
@@ -4391,7 +4391,7 @@
     <w:charset w:val="00"/>
     <w:family w:val="swiss"/>
     <w:pitch w:val="variable"/>
-    <w:sig w:usb0="E0002EFF" w:usb1="C000785B" w:usb2="00000009" w:usb3="00000000" w:csb0="000001FF" w:csb1="00000000"/>
+    <w:sig w:usb0="E0002AFF" w:usb1="C0007843" w:usb2="00000009" w:usb3="00000000" w:csb0="000001FF" w:csb1="00000000"/>
   </w:font>
   <w:font w:name="Cambria">
     <w:panose1 w:val="02040503050406030204"/>
@@ -4435,10 +4435,12 @@
   </w:compat>
   <w:rsids>
     <w:rsidRoot w:val="005B5315"/>
+    <w:rsid w:val="00080E14"/>
     <w:rsid w:val="0033150B"/>
     <w:rsid w:val="005B5315"/>
     <w:rsid w:val="00665505"/>
     <w:rsid w:val="006C0610"/>
+    <w:rsid w:val="007D3989"/>
     <w:rsid w:val="00895B32"/>
     <w:rsid w:val="00C14A3B"/>
     <w:rsid w:val="00C55341"/>
@@ -5231,6 +5233,35 @@
 </file>
 
 <file path=customXml/item1.xml><?xml version="1.0" encoding="utf-8"?>
+<FormTemplates xmlns="http://schemas.microsoft.com/sharepoint/v3/contenttype/forms">
+  <Display>DocumentLibraryForm</Display>
+  <Edit>DocumentLibraryForm</Edit>
+  <New>DocumentLibraryForm</New>
+</FormTemplates>
+</file>
+
+<file path=customXml/item2.xml><?xml version="1.0" encoding="utf-8"?>
+<TemplafyTextElementConfigurations xmlns:xsi="http://www.w3.org/2001/XMLSchema-instance" xmlns:xsd="http://www.w3.org/2001/XMLSchema">
+  <TextElement ElementMetadataLinkId="df376218-4c38-4aa4-8b59-a961649c97ea" TemplateId="637406175907311339">
+    <TemplateConfiguration>{"elementsMetadata":[{"elementConfiguration":{"binding":"{{Form.Zaaknummer}}","visibility":"","removeAndKeepContent":false,"disableUpdates":false,"type":"text"},"type":"richTextContentControl","id":"94d801df-61c3-4857-bc9e-cc91ddf1a1c8"},{"elementConfiguration":{"binding":"{{FormatDateTime(Form.DatumBW, Translate(\"Format_GeneralDate\"), DocumentLanguage)}}","visibility":"","removeAndKeepContent":false,"disableUpdates":false,"type":"text"},"type":"richTextContentControl","id":"e46b7afe-0408-4fef-babc-08e660804289"},{"elementConfiguration":{"binding":"{{Form.Portefeuillehouder.Naam}}","visibility":"","removeAndKeepContent":false,"disableUpdates":false,"type":"text"},"type":"richTextContentControl","id":"f223181f-f8bb-4e6d-a389-26c521c73df1"},{"elementConfiguration":{"binding":"{{FormatDateTime(Form.DatumCommissie, Translate(\"Format_GeneralDate\"), DocumentLanguage)}}","visibility":"","removeAndKeepContent":false,"disableUpdates":false,"type":"text"},"type":"richTextContentControl","id":"5102d976-03a6-4039-b8fc-215c371a0306"},{"elementConfiguration":{"binding":"{{FormatDateTime(Form.DatumRaad, Translate(\"Format_GeneralDate\"), DocumentLanguage)}}","visibility":"","removeAndKeepContent":false,"disableUpdates":false,"type":"text"},"type":"richTextContentControl","id":"0acf2c23-44ce-4c62-b481-2ba458a8c5d9"},{"elementConfiguration":{"binding":"{{Form.Eenheid.Eenheid}}","visibility":"","removeAndKeepContent":false,"disableUpdates":false,"type":"text"},"type":"richTextContentControl","id":"29fc1e57-0d4d-4cd8-8c77-d65f27eb4282"},{"elementConfiguration":{"binding":"{{Form.Adviseur}}","visibility":"","removeAndKeepContent":false,"disableUpdates":false,"type":"text"},"type":"richTextContentControl","id":"77adb052-e236-40e2-9da7-4708ab2e98af"},{"elementConfiguration":{"binding":"{{Form.Vertrouwelijk.Name}}","visibility":"","removeAndKeepContent":false,"disableUpdates":false,"type":"text"},"type":"richTextContentControl","id":"05d1c6c8-ad68-42d9-85c9-a48d29bd9db2"},{"elementConfiguration":{"binding":"{{Form.Aantalbijlagen.Aantal}}","visibility":"","removeAndKeepContent":false,"disableUpdates":false,"type":"text"},"type":"richTextContentControl","id":"b62af4e2-0e93-4a83-8d56-003e01f1a2ca"},{"elementConfiguration":{"binding":"{{Form.IBabsNummer}}","visibility":"","removeAndKeepContent":false,"disableUpdates":false,"type":"text"},"type":"richTextContentControl","id":"5c6cf1b9-069b-4afe-9c3c-151b065d1f74"}],"transformationConfigurations":[],"templateName":"6003 Wassenaar briefhoofd nota","templateDescription":"","enableDocumentContentUpdater":true,"version":"2.0"}</TemplateConfiguration>
+    <FormConfiguration>{"formFields":[{"helpTexts":{"prefix":"","postfix":""},"spacing":{},"type":"heading","name":"Gegevens","label":"Gegevens"},{"required":false,"placeholder":"","lines":0,"helpTexts":{"prefix":"","postfix":""},"spacing":{},"shareValue":false,"type":"textBox","name":"Zaaknummer","label":"Zaaknummer"},{"distinct":true,"hideIfNoUserInteractionRequired":false,"required":false,"autoSelectFirstOption":false,"helpTexts":{"prefix":"","postfix":""},"spacing":{},"shareValue":false,"type":"dropDown","dataSourceName":"WassenaarBWKeuzelijst","dataSourceFieldName":"Naam","name":"Portefeuillehouder","label":"Portefeuillehouder"},{"distinct":true,"hideIfNoUserInteractionRequired":false,"required":false,"autoSelectFirstOption":false,"helpTexts":{"prefix":"","postfix":""},"spacing":{},"shareValue":false,"type":"dropDown","dataSourceName":"WassenaarEenheden","dataSourceFieldName":"Eenheid","name":"Eenheid","label":"Eenheid"},{"required":false,"placeholder":"","lines":0,"helpTexts":{"prefix":"","postfix":""},"spacing":{},"shareValue":false,"type":"textBox","name":"Adviseur","label":"Adviseur"},{"distinct":true,"hideIfNoUserInteractionRequired":false,"required":false,"autoSelectFirstOption":false,"helpTexts":{"prefix":"","postfix":""},"spacing":{},"shareValue":false,"type":"dropDown","dataSourceName":"JaNee","dataSourceFieldName":"Name","name":"Vertrouwelijk","label":"Vertrouwelijk"},{"distinct":true,"hideIfNoUserInteractionRequired":false,"required":false,"autoSelectFirstOption":false,"helpTexts":{"prefix":"","postfix":""},"spacing":{},"shareValue":false,"type":"dropDown","dataSourceName":"WassenaarBijlagenbrief","dataSourceFieldName":"Aantal","name":"Aantalbijlagen","label":"Aantal bijlagen"},{"required":false,"placeholder":"","lines":0,"helpTexts":{"prefix":"","postfix":""},"spacing":{},"shareValue":false,"type":"textBox","name":"IBabsNummer","label":"Ibabsnummer"},{"helpTexts":{"prefix":"","postfix":""},"spacing":{},"type":"heading","name":"Data","label":"Data"},{"required":false,"helpTexts":{"prefix":"","postfix":""},"spacing":{},"shareValue":false,"type":"datePicker","name":"DatumBW","label":"Datum B&amp;W"},{"required":false,"helpTexts":{"prefix":"","postfix":""},"spacing":{},"shareValue":false,"type":"datePicker","name":"DatumCommissie","label":"Datum Commissie"},{"required":false,"helpTexts":{"prefix":"","postfix":""},"spacing":{},"shareValue":false,"type":"datePicker","name":"DatumRaad","label":"Datum Raad"}],"formDataEntries":[{"name":"Zaaknummer","value":"78o8yZ6ELGgE4OM8is8YcA=="},{"name":"Portefeuillehouder","value":"4xcGzgY2Cqq1vdvZ2Z5nYnwVdUxcok1GKG+m+MUPzA8="},{"name":"Eenheid","value":"Bhr8g0UhqIgqbKUeLFw8jIukHWkEqiLL357LKKTeUi0="},{"name":"Adviseur","value":"VWuMMTcxHkL0SngeRqqmvQ=="},{"name":"Vertrouwelijk","value":"IDGA0LrvcA42ChRRpeqWPrDvukpOz2XT2jWmDFPlJ+0="},{"name":"Aantalbijlagen","value":"Jh0qKRqsT2UZqnXuDZtM7rh4b7xwzFAugI172DeU0cA="}]}</FormConfiguration>
+  </TextElement>
+  <TextElement ElementMetadataLinkId="4ae4fae3-fd0b-43cd-b0cd-5846686230ce" TemplateId="638006506578557856">
+    <TemplateConfiguration>{"elementsMetadata":[],"transformationConfigurations":[],"templateName":"6019 Wassenaar huisstijl Collegenota","templateDescription":"","enableDocumentContentUpdater":true,"version":"2.0"}</TemplateConfiguration>
+    <FormConfiguration>{"formFields":[],"formDataEntries":[]}</FormConfiguration>
+  </TextElement>
+</TemplafyTextElementConfigurations>
+</file>
+
+<file path=customXml/item3.xml><?xml version="1.0" encoding="utf-8"?>
+<TemplafyFormConfiguration><![CDATA[{"formFields":[{"type":"textElementPlaceholder","name":"TextElement1","label":"Huisstijl Wassenaar"},{"type":"textElementPlaceholder","name":"TextElement2","label":"Nota briefhoofd Wassenaar "},{"defaultValue":{"fixedValue":true},"helpTexts":{"prefix":"","postfix":""},"spacing":{},"shareValue":false,"type":"checkBox","name":"Digitaal","label":"Wassenaar digitaal briefpapier (Standaard aan)"}],"formDataEntries":[{"name":"Digitaal","value":"tCU+Yei8JjApjP+H1GevYg=="}]}]]></TemplafyFormConfiguration>
+</file>
+
+<file path=customXml/item4.xml><?xml version="1.0" encoding="utf-8"?>
+<TemplafyTemplateConfiguration><![CDATA[{"elementsMetadata":[{"elementConfiguration":{"assetId":"637406175907311339","visibility":"","textElementPlaceholderName":"TextElement2","replaceOnUpdate":false,"type":"textElement"},"type":"richTextContentControl","id":"df376218-4c38-4aa4-8b59-a961649c97ea"},{"elementConfiguration":{"visibility":"{{IfElse(Not(Form.Digitaal), VisibilityType.Hidden, VisibilityType.Visible)}}","disableUpdates":false,"type":"group"},"type":"richTextContentControl","id":"d8ee57ea-a7fc-4e19-b955-71aeb151c4dc"},{"elementConfiguration":{"assetId":"638006506578557856","visibility":"","textElementPlaceholderName":"TextElement1","replaceOnUpdate":false,"type":"textElement"},"type":"richTextContentControl","id":"4ae4fae3-fd0b-43cd-b0cd-5846686230ce"}],"transformationConfigurations":[],"templateName":"20120 Wassenaar Collegevoorstel - Adviesnota","templateDescription":"","enableDocumentContentUpdater":true,"version":"2.0"}]]></TemplafyTemplateConfiguration>
+</file>
+
+<file path=customXml/item5.xml><?xml version="1.0" encoding="utf-8"?>
 <ct:contentTypeSchema xmlns:ct="http://schemas.microsoft.com/office/2006/metadata/contentType" xmlns:ma="http://schemas.microsoft.com/office/2006/metadata/properties/metaAttributes" ct:_="" ma:_="" ma:contentTypeName="Document" ma:contentTypeID="0x0101009C3CCF29AC71D4428C978BA42A6A441C" ma:contentTypeVersion="34" ma:contentTypeDescription="Een nieuw document maken." ma:contentTypeScope="" ma:versionID="7d158b9b3fd3ec60989cb2b3e32d5771">
   <xs:schema xmlns:xsd="http://www.w3.org/2001/XMLSchema" xmlns:xs="http://www.w3.org/2001/XMLSchema" xmlns:p="http://schemas.microsoft.com/office/2006/metadata/properties" xmlns:ns1="http://schemas.microsoft.com/sharepoint/v3" xmlns:ns2="aacb7df8-672f-46f2-977f-893ce5cef86b" xmlns:ns3="22a3f1e7-1ad8-4567-967d-700183da1d1b" targetNamespace="http://schemas.microsoft.com/office/2006/metadata/properties" ma:root="true" ma:fieldsID="b2ea9b1e2fb62c990773d12b5caa2323" ns1:_="" ns2:_="" ns3:_="">
     <xs:import namespace="http://schemas.microsoft.com/sharepoint/v3"/>
@@ -5490,36 +5521,35 @@
 </ct:contentTypeSchema>
 </file>
 
-<file path=customXml/item2.xml><?xml version="1.0" encoding="utf-8"?>
-<TemplafyTemplateConfiguration><![CDATA[{"elementsMetadata":[{"elementConfiguration":{"assetId":"637406175907311339","visibility":"","textElementPlaceholderName":"TextElement2","replaceOnUpdate":false,"type":"textElement"},"type":"richTextContentControl","id":"df376218-4c38-4aa4-8b59-a961649c97ea"},{"elementConfiguration":{"visibility":"{{IfElse(Not(Form.Digitaal), VisibilityType.Hidden, VisibilityType.Visible)}}","disableUpdates":false,"type":"group"},"type":"richTextContentControl","id":"d8ee57ea-a7fc-4e19-b955-71aeb151c4dc"},{"elementConfiguration":{"assetId":"638006506578557856","visibility":"","textElementPlaceholderName":"TextElement1","replaceOnUpdate":false,"type":"textElement"},"type":"richTextContentControl","id":"4ae4fae3-fd0b-43cd-b0cd-5846686230ce"}],"transformationConfigurations":[],"templateName":"20120 Wassenaar Collegevoorstel - Adviesnota","templateDescription":"","enableDocumentContentUpdater":true,"version":"2.0"}]]></TemplafyTemplateConfiguration>
+<file path=customXml/itemProps1.xml><?xml version="1.0" encoding="utf-8"?>
+<ds:datastoreItem xmlns:ds="http://schemas.openxmlformats.org/officeDocument/2006/customXml" ds:itemID="{3E07E536-AAF9-4CEB-8440-FE31B84223AF}">
+  <ds:schemaRefs>
+    <ds:schemaRef ds:uri="http://schemas.microsoft.com/sharepoint/v3/contenttype/forms"/>
+  </ds:schemaRefs>
+</ds:datastoreItem>
 </file>
 
-<file path=customXml/item3.xml><?xml version="1.0" encoding="utf-8"?>
-<TemplafyFormConfiguration><![CDATA[{"formFields":[{"type":"textElementPlaceholder","name":"TextElement1","label":"Huisstijl Wassenaar"},{"type":"textElementPlaceholder","name":"TextElement2","label":"Nota briefhoofd Wassenaar "},{"defaultValue":{"fixedValue":true},"helpTexts":{"prefix":"","postfix":""},"spacing":{},"shareValue":false,"type":"checkBox","name":"Digitaal","label":"Wassenaar digitaal briefpapier (Standaard aan)"}],"formDataEntries":[{"name":"Digitaal","value":"tCU+Yei8JjApjP+H1GevYg=="}]}]]></TemplafyFormConfiguration>
+<file path=customXml/itemProps2.xml><?xml version="1.0" encoding="utf-8"?>
+<ds:datastoreItem xmlns:ds="http://schemas.openxmlformats.org/officeDocument/2006/customXml" ds:itemID="{622639DA-8FDC-4CFE-B6F0-DEE418A41103}">
+  <ds:schemaRefs>
+    <ds:schemaRef ds:uri="http://www.w3.org/2001/XMLSchema"/>
+  </ds:schemaRefs>
+</ds:datastoreItem>
 </file>
 
-<file path=customXml/item4.xml><?xml version="1.0" encoding="utf-8"?>
-<TemplafyTextElementConfigurations xmlns:xsi="http://www.w3.org/2001/XMLSchema-instance" xmlns:xsd="http://www.w3.org/2001/XMLSchema">
-  <TextElement ElementMetadataLinkId="df376218-4c38-4aa4-8b59-a961649c97ea" TemplateId="637406175907311339">
-    <TemplateConfiguration>{"elementsMetadata":[{"elementConfiguration":{"binding":"{{Form.Zaaknummer}}","visibility":"","removeAndKeepContent":false,"disableUpdates":false,"type":"text"},"type":"richTextContentControl","id":"94d801df-61c3-4857-bc9e-cc91ddf1a1c8"},{"elementConfiguration":{"binding":"{{FormatDateTime(Form.DatumBW, Translate(\"Format_GeneralDate\"), DocumentLanguage)}}","visibility":"","removeAndKeepContent":false,"disableUpdates":false,"type":"text"},"type":"richTextContentControl","id":"e46b7afe-0408-4fef-babc-08e660804289"},{"elementConfiguration":{"binding":"{{Form.Portefeuillehouder.Naam}}","visibility":"","removeAndKeepContent":false,"disableUpdates":false,"type":"text"},"type":"richTextContentControl","id":"f223181f-f8bb-4e6d-a389-26c521c73df1"},{"elementConfiguration":{"binding":"{{FormatDateTime(Form.DatumCommissie, Translate(\"Format_GeneralDate\"), DocumentLanguage)}}","visibility":"","removeAndKeepContent":false,"disableUpdates":false,"type":"text"},"type":"richTextContentControl","id":"5102d976-03a6-4039-b8fc-215c371a0306"},{"elementConfiguration":{"binding":"{{FormatDateTime(Form.DatumRaad, Translate(\"Format_GeneralDate\"), DocumentLanguage)}}","visibility":"","removeAndKeepContent":false,"disableUpdates":false,"type":"text"},"type":"richTextContentControl","id":"0acf2c23-44ce-4c62-b481-2ba458a8c5d9"},{"elementConfiguration":{"binding":"{{Form.Eenheid.Eenheid}}","visibility":"","removeAndKeepContent":false,"disableUpdates":false,"type":"text"},"type":"richTextContentControl","id":"29fc1e57-0d4d-4cd8-8c77-d65f27eb4282"},{"elementConfiguration":{"binding":"{{Form.Adviseur}}","visibility":"","removeAndKeepContent":false,"disableUpdates":false,"type":"text"},"type":"richTextContentControl","id":"77adb052-e236-40e2-9da7-4708ab2e98af"},{"elementConfiguration":{"binding":"{{Form.Vertrouwelijk.Name}}","visibility":"","removeAndKeepContent":false,"disableUpdates":false,"type":"text"},"type":"richTextContentControl","id":"05d1c6c8-ad68-42d9-85c9-a48d29bd9db2"},{"elementConfiguration":{"binding":"{{Form.Aantalbijlagen.Aantal}}","visibility":"","removeAndKeepContent":false,"disableUpdates":false,"type":"text"},"type":"richTextContentControl","id":"b62af4e2-0e93-4a83-8d56-003e01f1a2ca"},{"elementConfiguration":{"binding":"{{Form.IBabsNummer}}","visibility":"","removeAndKeepContent":false,"disableUpdates":false,"type":"text"},"type":"richTextContentControl","id":"5c6cf1b9-069b-4afe-9c3c-151b065d1f74"}],"transformationConfigurations":[],"templateName":"6003 Wassenaar briefhoofd nota","templateDescription":"","enableDocumentContentUpdater":true,"version":"2.0"}</TemplateConfiguration>
-    <FormConfiguration>{"formFields":[{"helpTexts":{"prefix":"","postfix":""},"spacing":{},"type":"heading","name":"Gegevens","label":"Gegevens"},{"required":false,"placeholder":"","lines":0,"helpTexts":{"prefix":"","postfix":""},"spacing":{},"shareValue":false,"type":"textBox","name":"Zaaknummer","label":"Zaaknummer"},{"distinct":true,"hideIfNoUserInteractionRequired":false,"required":false,"autoSelectFirstOption":false,"helpTexts":{"prefix":"","postfix":""},"spacing":{},"shareValue":false,"type":"dropDown","dataSourceName":"WassenaarBWKeuzelijst","dataSourceFieldName":"Naam","name":"Portefeuillehouder","label":"Portefeuillehouder"},{"distinct":true,"hideIfNoUserInteractionRequired":false,"required":false,"autoSelectFirstOption":false,"helpTexts":{"prefix":"","postfix":""},"spacing":{},"shareValue":false,"type":"dropDown","dataSourceName":"WassenaarEenheden","dataSourceFieldName":"Eenheid","name":"Eenheid","label":"Eenheid"},{"required":false,"placeholder":"","lines":0,"helpTexts":{"prefix":"","postfix":""},"spacing":{},"shareValue":false,"type":"textBox","name":"Adviseur","label":"Adviseur"},{"distinct":true,"hideIfNoUserInteractionRequired":false,"required":false,"autoSelectFirstOption":false,"helpTexts":{"prefix":"","postfix":""},"spacing":{},"shareValue":false,"type":"dropDown","dataSourceName":"JaNee","dataSourceFieldName":"Name","name":"Vertrouwelijk","label":"Vertrouwelijk"},{"distinct":true,"hideIfNoUserInteractionRequired":false,"required":false,"autoSelectFirstOption":false,"helpTexts":{"prefix":"","postfix":""},"spacing":{},"shareValue":false,"type":"dropDown","dataSourceName":"WassenaarBijlagenbrief","dataSourceFieldName":"Aantal","name":"Aantalbijlagen","label":"Aantal bijlagen"},{"required":false,"placeholder":"","lines":0,"helpTexts":{"prefix":"","postfix":""},"spacing":{},"shareValue":false,"type":"textBox","name":"IBabsNummer","label":"Ibabsnummer"},{"helpTexts":{"prefix":"","postfix":""},"spacing":{},"type":"heading","name":"Data","label":"Data"},{"required":false,"helpTexts":{"prefix":"","postfix":""},"spacing":{},"shareValue":false,"type":"datePicker","name":"DatumBW","label":"Datum B&amp;W"},{"required":false,"helpTexts":{"prefix":"","postfix":""},"spacing":{},"shareValue":false,"type":"datePicker","name":"DatumCommissie","label":"Datum Commissie"},{"required":false,"helpTexts":{"prefix":"","postfix":""},"spacing":{},"shareValue":false,"type":"datePicker","name":"DatumRaad","label":"Datum Raad"}],"formDataEntries":[{"name":"Zaaknummer","value":"78o8yZ6ELGgE4OM8is8YcA=="},{"name":"Portefeuillehouder","value":"4xcGzgY2Cqq1vdvZ2Z5nYnwVdUxcok1GKG+m+MUPzA8="},{"name":"Eenheid","value":"Bhr8g0UhqIgqbKUeLFw8jIukHWkEqiLL357LKKTeUi0="},{"name":"Adviseur","value":"VWuMMTcxHkL0SngeRqqmvQ=="},{"name":"Vertrouwelijk","value":"IDGA0LrvcA42ChRRpeqWPrDvukpOz2XT2jWmDFPlJ+0="},{"name":"Aantalbijlagen","value":"Jh0qKRqsT2UZqnXuDZtM7rh4b7xwzFAugI172DeU0cA="}]}</FormConfiguration>
-  </TextElement>
-  <TextElement ElementMetadataLinkId="4ae4fae3-fd0b-43cd-b0cd-5846686230ce" TemplateId="638006506578557856">
-    <TemplateConfiguration>{"elementsMetadata":[],"transformationConfigurations":[],"templateName":"6019 Wassenaar huisstijl Collegenota","templateDescription":"","enableDocumentContentUpdater":true,"version":"2.0"}</TemplateConfiguration>
-    <FormConfiguration>{"formFields":[],"formDataEntries":[]}</FormConfiguration>
-  </TextElement>
-</TemplafyTextElementConfigurations>
+<file path=customXml/itemProps3.xml><?xml version="1.0" encoding="utf-8"?>
+<ds:datastoreItem xmlns:ds="http://schemas.openxmlformats.org/officeDocument/2006/customXml" ds:itemID="{FAB146B6-0E15-46E3-B8EC-1CB529FB97FD}">
+  <ds:schemaRefs/>
+</ds:datastoreItem>
 </file>
 
-<file path=customXml/item5.xml><?xml version="1.0" encoding="utf-8"?>
-<FormTemplates xmlns="http://schemas.microsoft.com/sharepoint/v3/contenttype/forms">
-  <Display>DocumentLibraryForm</Display>
-  <Edit>DocumentLibraryForm</Edit>
-  <New>DocumentLibraryForm</New>
-</FormTemplates>
+<file path=customXml/itemProps4.xml><?xml version="1.0" encoding="utf-8"?>
+<ds:datastoreItem xmlns:ds="http://schemas.openxmlformats.org/officeDocument/2006/customXml" ds:itemID="{85F62C97-E663-4AF1-BD37-94A4948CD409}">
+  <ds:schemaRefs/>
+</ds:datastoreItem>
 </file>
 
-<file path=customXml/itemProps1.xml><?xml version="1.0" encoding="utf-8"?>
+<file path=customXml/itemProps5.xml><?xml version="1.0" encoding="utf-8"?>
 <ds:datastoreItem xmlns:ds="http://schemas.openxmlformats.org/officeDocument/2006/customXml" ds:itemID="{F4B0E540-4026-42F5-BCCC-4721871FF053}">
   <ds:schemaRefs>
     <ds:schemaRef ds:uri="http://schemas.microsoft.com/office/2006/metadata/contentType"/>
@@ -5537,32 +5567,4 @@
     <ds:schemaRef ds:uri="http://schemas.microsoft.com/internal/obd"/>
   </ds:schemaRefs>
 </ds:datastoreItem>
-</file>
-
-<file path=customXml/itemProps2.xml><?xml version="1.0" encoding="utf-8"?>
-<ds:datastoreItem xmlns:ds="http://schemas.openxmlformats.org/officeDocument/2006/customXml" ds:itemID="{85F62C97-E663-4AF1-BD37-94A4948CD409}">
-  <ds:schemaRefs/>
-</ds:datastoreItem>
-</file>
-
-<file path=customXml/itemProps3.xml><?xml version="1.0" encoding="utf-8"?>
-<ds:datastoreItem xmlns:ds="http://schemas.openxmlformats.org/officeDocument/2006/customXml" ds:itemID="{FAB146B6-0E15-46E3-B8EC-1CB529FB97FD}">
-  <ds:schemaRefs/>
-</ds:datastoreItem>
-</file>
-
-<file path=customXml/itemProps4.xml><?xml version="1.0" encoding="utf-8"?>
-<ds:datastoreItem xmlns:ds="http://schemas.openxmlformats.org/officeDocument/2006/customXml" ds:itemID="{622639DA-8FDC-4CFE-B6F0-DEE418A41103}">
-  <ds:schemaRefs>
-    <ds:schemaRef ds:uri="http://www.w3.org/2001/XMLSchema"/>
-  </ds:schemaRefs>
-</ds:datastoreItem>
-</file>
-
-<file path=customXml/itemProps5.xml><?xml version="1.0" encoding="utf-8"?>
-<ds:datastoreItem xmlns:ds="http://schemas.openxmlformats.org/officeDocument/2006/customXml" ds:itemID="{3E07E536-AAF9-4CEB-8440-FE31B84223AF}">
-  <ds:schemaRefs>
-    <ds:schemaRef ds:uri="http://schemas.microsoft.com/sharepoint/v3/contenttype/forms"/>
-  </ds:schemaRefs>
-</ds:datastoreItem>
 </file>
</xml_diff>